<commit_message>
remove old project and upload PRD report
</commit_message>
<xml_diff>
--- a/PRD_BaoCao.docx
+++ b/PRD_BaoCao.docx
@@ -73,12 +73,6 @@
         <w:gridCol w:w="3600"/>
       </w:tblGrid>
       <w:tr>
-        <w:tblPrEx>
-          <w:tblCellMar>
-            <w:top w:w="0" w:type="dxa"/>
-            <w:bottom w:w="0" w:type="dxa"/>
-          </w:tblCellMar>
-        </w:tblPrEx>
         <w:tc>
           <w:tcPr>
             <w:tcW w:w="2400" w:type="dxa"/>
@@ -125,18 +119,12 @@
           </w:tcPr>
           <w:p>
             <w:r>
-              <w:t>[Tên sản phẩm]</w:t>
+              <w:t>Phố ẩm thực Vĩnh Khánh</w:t>
             </w:r>
           </w:p>
         </w:tc>
       </w:tr>
       <w:tr>
-        <w:tblPrEx>
-          <w:tblCellMar>
-            <w:top w:w="0" w:type="dxa"/>
-            <w:bottom w:w="0" w:type="dxa"/>
-          </w:tblCellMar>
-        </w:tblPrEx>
         <w:tc>
           <w:tcPr>
             <w:tcW w:w="2400" w:type="dxa"/>
@@ -189,12 +177,6 @@
         </w:tc>
       </w:tr>
       <w:tr>
-        <w:tblPrEx>
-          <w:tblCellMar>
-            <w:top w:w="0" w:type="dxa"/>
-            <w:bottom w:w="0" w:type="dxa"/>
-          </w:tblCellMar>
-        </w:tblPrEx>
         <w:tc>
           <w:tcPr>
             <w:tcW w:w="2400" w:type="dxa"/>
@@ -247,12 +229,6 @@
         </w:tc>
       </w:tr>
       <w:tr>
-        <w:tblPrEx>
-          <w:tblCellMar>
-            <w:top w:w="0" w:type="dxa"/>
-            <w:bottom w:w="0" w:type="dxa"/>
-          </w:tblCellMar>
-        </w:tblPrEx>
         <w:tc>
           <w:tcPr>
             <w:tcW w:w="2400" w:type="dxa"/>
@@ -305,12 +281,6 @@
         </w:tc>
       </w:tr>
       <w:tr>
-        <w:tblPrEx>
-          <w:tblCellMar>
-            <w:top w:w="0" w:type="dxa"/>
-            <w:bottom w:w="0" w:type="dxa"/>
-          </w:tblCellMar>
-        </w:tblPrEx>
         <w:tc>
           <w:tcPr>
             <w:tcW w:w="2400" w:type="dxa"/>
@@ -522,12 +492,6 @@
         <w:gridCol w:w="2360"/>
       </w:tblGrid>
       <w:tr>
-        <w:tblPrEx>
-          <w:tblCellMar>
-            <w:top w:w="0" w:type="dxa"/>
-            <w:bottom w:w="0" w:type="dxa"/>
-          </w:tblCellMar>
-        </w:tblPrEx>
         <w:trPr>
           <w:tblHeader/>
         </w:trPr>
@@ -666,12 +630,6 @@
         </w:tc>
       </w:tr>
       <w:tr>
-        <w:tblPrEx>
-          <w:tblCellMar>
-            <w:top w:w="0" w:type="dxa"/>
-            <w:bottom w:w="0" w:type="dxa"/>
-          </w:tblCellMar>
-        </w:tblPrEx>
         <w:tc>
           <w:tcPr>
             <w:tcW w:w="2000" w:type="dxa"/>
@@ -758,12 +716,6 @@
         </w:tc>
       </w:tr>
       <w:tr>
-        <w:tblPrEx>
-          <w:tblCellMar>
-            <w:top w:w="0" w:type="dxa"/>
-            <w:bottom w:w="0" w:type="dxa"/>
-          </w:tblCellMar>
-        </w:tblPrEx>
         <w:tc>
           <w:tcPr>
             <w:tcW w:w="2000" w:type="dxa"/>
@@ -850,12 +802,6 @@
         </w:tc>
       </w:tr>
       <w:tr>
-        <w:tblPrEx>
-          <w:tblCellMar>
-            <w:top w:w="0" w:type="dxa"/>
-            <w:bottom w:w="0" w:type="dxa"/>
-          </w:tblCellMar>
-        </w:tblPrEx>
         <w:tc>
           <w:tcPr>
             <w:tcW w:w="2000" w:type="dxa"/>
@@ -1146,12 +1092,6 @@
         <w:gridCol w:w="2530"/>
       </w:tblGrid>
       <w:tr>
-        <w:tblPrEx>
-          <w:tblCellMar>
-            <w:top w:w="0" w:type="dxa"/>
-            <w:bottom w:w="0" w:type="dxa"/>
-          </w:tblCellMar>
-        </w:tblPrEx>
         <w:trPr>
           <w:tblHeader/>
         </w:trPr>
@@ -1289,12 +1229,6 @@
         </w:tc>
       </w:tr>
       <w:tr>
-        <w:tblPrEx>
-          <w:tblCellMar>
-            <w:top w:w="0" w:type="dxa"/>
-            <w:bottom w:w="0" w:type="dxa"/>
-          </w:tblCellMar>
-        </w:tblPrEx>
         <w:tc>
           <w:tcPr>
             <w:tcW w:w="2500" w:type="dxa"/>
@@ -1389,12 +1323,6 @@
         </w:tc>
       </w:tr>
       <w:tr>
-        <w:tblPrEx>
-          <w:tblCellMar>
-            <w:top w:w="0" w:type="dxa"/>
-            <w:bottom w:w="0" w:type="dxa"/>
-          </w:tblCellMar>
-        </w:tblPrEx>
         <w:tc>
           <w:tcPr>
             <w:tcW w:w="2500" w:type="dxa"/>
@@ -1489,12 +1417,6 @@
         </w:tc>
       </w:tr>
       <w:tr>
-        <w:tblPrEx>
-          <w:tblCellMar>
-            <w:top w:w="0" w:type="dxa"/>
-            <w:bottom w:w="0" w:type="dxa"/>
-          </w:tblCellMar>
-        </w:tblPrEx>
         <w:tc>
           <w:tcPr>
             <w:tcW w:w="2500" w:type="dxa"/>
@@ -1589,12 +1511,6 @@
         </w:tc>
       </w:tr>
       <w:tr>
-        <w:tblPrEx>
-          <w:tblCellMar>
-            <w:top w:w="0" w:type="dxa"/>
-            <w:bottom w:w="0" w:type="dxa"/>
-          </w:tblCellMar>
-        </w:tblPrEx>
         <w:tc>
           <w:tcPr>
             <w:tcW w:w="2500" w:type="dxa"/>
@@ -1689,12 +1605,6 @@
         </w:tc>
       </w:tr>
       <w:tr>
-        <w:tblPrEx>
-          <w:tblCellMar>
-            <w:top w:w="0" w:type="dxa"/>
-            <w:bottom w:w="0" w:type="dxa"/>
-          </w:tblCellMar>
-        </w:tblPrEx>
         <w:tc>
           <w:tcPr>
             <w:tcW w:w="2500" w:type="dxa"/>
@@ -1851,12 +1761,6 @@
         <w:gridCol w:w="6360"/>
       </w:tblGrid>
       <w:tr>
-        <w:tblPrEx>
-          <w:tblCellMar>
-            <w:top w:w="0" w:type="dxa"/>
-            <w:bottom w:w="0" w:type="dxa"/>
-          </w:tblCellMar>
-        </w:tblPrEx>
         <w:trPr>
           <w:tblHeader/>
         </w:trPr>
@@ -1928,12 +1832,6 @@
         </w:tc>
       </w:tr>
       <w:tr>
-        <w:tblPrEx>
-          <w:tblCellMar>
-            <w:top w:w="0" w:type="dxa"/>
-            <w:bottom w:w="0" w:type="dxa"/>
-          </w:tblCellMar>
-        </w:tblPrEx>
         <w:tc>
           <w:tcPr>
             <w:tcW w:w="3000" w:type="dxa"/>
@@ -1990,12 +1888,6 @@
         </w:tc>
       </w:tr>
       <w:tr>
-        <w:tblPrEx>
-          <w:tblCellMar>
-            <w:top w:w="0" w:type="dxa"/>
-            <w:bottom w:w="0" w:type="dxa"/>
-          </w:tblCellMar>
-        </w:tblPrEx>
         <w:tc>
           <w:tcPr>
             <w:tcW w:w="3000" w:type="dxa"/>
@@ -2052,12 +1944,6 @@
         </w:tc>
       </w:tr>
       <w:tr>
-        <w:tblPrEx>
-          <w:tblCellMar>
-            <w:top w:w="0" w:type="dxa"/>
-            <w:bottom w:w="0" w:type="dxa"/>
-          </w:tblCellMar>
-        </w:tblPrEx>
         <w:tc>
           <w:tcPr>
             <w:tcW w:w="3000" w:type="dxa"/>
@@ -2114,12 +2000,6 @@
         </w:tc>
       </w:tr>
       <w:tr>
-        <w:tblPrEx>
-          <w:tblCellMar>
-            <w:top w:w="0" w:type="dxa"/>
-            <w:bottom w:w="0" w:type="dxa"/>
-          </w:tblCellMar>
-        </w:tblPrEx>
         <w:tc>
           <w:tcPr>
             <w:tcW w:w="3000" w:type="dxa"/>
@@ -2176,12 +2056,6 @@
         </w:tc>
       </w:tr>
       <w:tr>
-        <w:tblPrEx>
-          <w:tblCellMar>
-            <w:top w:w="0" w:type="dxa"/>
-            <w:bottom w:w="0" w:type="dxa"/>
-          </w:tblCellMar>
-        </w:tblPrEx>
         <w:tc>
           <w:tcPr>
             <w:tcW w:w="3000" w:type="dxa"/>
@@ -2238,12 +2112,6 @@
         </w:tc>
       </w:tr>
       <w:tr>
-        <w:tblPrEx>
-          <w:tblCellMar>
-            <w:top w:w="0" w:type="dxa"/>
-            <w:bottom w:w="0" w:type="dxa"/>
-          </w:tblCellMar>
-        </w:tblPrEx>
         <w:tc>
           <w:tcPr>
             <w:tcW w:w="3000" w:type="dxa"/>
@@ -2335,12 +2203,6 @@
         <w:gridCol w:w="6360"/>
       </w:tblGrid>
       <w:tr>
-        <w:tblPrEx>
-          <w:tblCellMar>
-            <w:top w:w="0" w:type="dxa"/>
-            <w:bottom w:w="0" w:type="dxa"/>
-          </w:tblCellMar>
-        </w:tblPrEx>
         <w:trPr>
           <w:tblHeader/>
         </w:trPr>
@@ -2412,12 +2274,6 @@
         </w:tc>
       </w:tr>
       <w:tr>
-        <w:tblPrEx>
-          <w:tblCellMar>
-            <w:top w:w="0" w:type="dxa"/>
-            <w:bottom w:w="0" w:type="dxa"/>
-          </w:tblCellMar>
-        </w:tblPrEx>
         <w:tc>
           <w:tcPr>
             <w:tcW w:w="3000" w:type="dxa"/>
@@ -2474,12 +2330,6 @@
         </w:tc>
       </w:tr>
       <w:tr>
-        <w:tblPrEx>
-          <w:tblCellMar>
-            <w:top w:w="0" w:type="dxa"/>
-            <w:bottom w:w="0" w:type="dxa"/>
-          </w:tblCellMar>
-        </w:tblPrEx>
         <w:tc>
           <w:tcPr>
             <w:tcW w:w="3000" w:type="dxa"/>
@@ -2536,12 +2386,6 @@
         </w:tc>
       </w:tr>
       <w:tr>
-        <w:tblPrEx>
-          <w:tblCellMar>
-            <w:top w:w="0" w:type="dxa"/>
-            <w:bottom w:w="0" w:type="dxa"/>
-          </w:tblCellMar>
-        </w:tblPrEx>
         <w:tc>
           <w:tcPr>
             <w:tcW w:w="3000" w:type="dxa"/>
@@ -2598,12 +2442,6 @@
         </w:tc>
       </w:tr>
       <w:tr>
-        <w:tblPrEx>
-          <w:tblCellMar>
-            <w:top w:w="0" w:type="dxa"/>
-            <w:bottom w:w="0" w:type="dxa"/>
-          </w:tblCellMar>
-        </w:tblPrEx>
         <w:tc>
           <w:tcPr>
             <w:tcW w:w="3000" w:type="dxa"/>
@@ -2660,12 +2498,6 @@
         </w:tc>
       </w:tr>
       <w:tr>
-        <w:tblPrEx>
-          <w:tblCellMar>
-            <w:top w:w="0" w:type="dxa"/>
-            <w:bottom w:w="0" w:type="dxa"/>
-          </w:tblCellMar>
-        </w:tblPrEx>
         <w:tc>
           <w:tcPr>
             <w:tcW w:w="3000" w:type="dxa"/>
@@ -2722,12 +2554,6 @@
         </w:tc>
       </w:tr>
       <w:tr>
-        <w:tblPrEx>
-          <w:tblCellMar>
-            <w:top w:w="0" w:type="dxa"/>
-            <w:bottom w:w="0" w:type="dxa"/>
-          </w:tblCellMar>
-        </w:tblPrEx>
         <w:tc>
           <w:tcPr>
             <w:tcW w:w="3000" w:type="dxa"/>
@@ -2819,12 +2645,6 @@
         <w:gridCol w:w="6360"/>
       </w:tblGrid>
       <w:tr>
-        <w:tblPrEx>
-          <w:tblCellMar>
-            <w:top w:w="0" w:type="dxa"/>
-            <w:bottom w:w="0" w:type="dxa"/>
-          </w:tblCellMar>
-        </w:tblPrEx>
         <w:trPr>
           <w:tblHeader/>
         </w:trPr>
@@ -2896,12 +2716,6 @@
         </w:tc>
       </w:tr>
       <w:tr>
-        <w:tblPrEx>
-          <w:tblCellMar>
-            <w:top w:w="0" w:type="dxa"/>
-            <w:bottom w:w="0" w:type="dxa"/>
-          </w:tblCellMar>
-        </w:tblPrEx>
         <w:tc>
           <w:tcPr>
             <w:tcW w:w="3000" w:type="dxa"/>
@@ -2958,12 +2772,6 @@
         </w:tc>
       </w:tr>
       <w:tr>
-        <w:tblPrEx>
-          <w:tblCellMar>
-            <w:top w:w="0" w:type="dxa"/>
-            <w:bottom w:w="0" w:type="dxa"/>
-          </w:tblCellMar>
-        </w:tblPrEx>
         <w:tc>
           <w:tcPr>
             <w:tcW w:w="3000" w:type="dxa"/>
@@ -3020,12 +2828,6 @@
         </w:tc>
       </w:tr>
       <w:tr>
-        <w:tblPrEx>
-          <w:tblCellMar>
-            <w:top w:w="0" w:type="dxa"/>
-            <w:bottom w:w="0" w:type="dxa"/>
-          </w:tblCellMar>
-        </w:tblPrEx>
         <w:tc>
           <w:tcPr>
             <w:tcW w:w="3000" w:type="dxa"/>
@@ -3082,12 +2884,6 @@
         </w:tc>
       </w:tr>
       <w:tr>
-        <w:tblPrEx>
-          <w:tblCellMar>
-            <w:top w:w="0" w:type="dxa"/>
-            <w:bottom w:w="0" w:type="dxa"/>
-          </w:tblCellMar>
-        </w:tblPrEx>
         <w:tc>
           <w:tcPr>
             <w:tcW w:w="3000" w:type="dxa"/>
@@ -3144,12 +2940,6 @@
         </w:tc>
       </w:tr>
       <w:tr>
-        <w:tblPrEx>
-          <w:tblCellMar>
-            <w:top w:w="0" w:type="dxa"/>
-            <w:bottom w:w="0" w:type="dxa"/>
-          </w:tblCellMar>
-        </w:tblPrEx>
         <w:tc>
           <w:tcPr>
             <w:tcW w:w="3000" w:type="dxa"/>
@@ -3206,12 +2996,6 @@
         </w:tc>
       </w:tr>
       <w:tr>
-        <w:tblPrEx>
-          <w:tblCellMar>
-            <w:top w:w="0" w:type="dxa"/>
-            <w:bottom w:w="0" w:type="dxa"/>
-          </w:tblCellMar>
-        </w:tblPrEx>
         <w:tc>
           <w:tcPr>
             <w:tcW w:w="3000" w:type="dxa"/>
@@ -3484,12 +3268,6 @@
         <w:gridCol w:w="2360"/>
       </w:tblGrid>
       <w:tr>
-        <w:tblPrEx>
-          <w:tblCellMar>
-            <w:top w:w="0" w:type="dxa"/>
-            <w:bottom w:w="0" w:type="dxa"/>
-          </w:tblCellMar>
-        </w:tblPrEx>
         <w:trPr>
           <w:tblHeader/>
         </w:trPr>
@@ -3594,12 +3372,6 @@
         </w:tc>
       </w:tr>
       <w:tr>
-        <w:tblPrEx>
-          <w:tblCellMar>
-            <w:top w:w="0" w:type="dxa"/>
-            <w:bottom w:w="0" w:type="dxa"/>
-          </w:tblCellMar>
-        </w:tblPrEx>
         <w:tc>
           <w:tcPr>
             <w:tcW w:w="2000" w:type="dxa"/>
@@ -3683,12 +3455,6 @@
         </w:tc>
       </w:tr>
       <w:tr>
-        <w:tblPrEx>
-          <w:tblCellMar>
-            <w:top w:w="0" w:type="dxa"/>
-            <w:bottom w:w="0" w:type="dxa"/>
-          </w:tblCellMar>
-        </w:tblPrEx>
         <w:tc>
           <w:tcPr>
             <w:tcW w:w="2000" w:type="dxa"/>
@@ -3772,12 +3538,6 @@
         </w:tc>
       </w:tr>
       <w:tr>
-        <w:tblPrEx>
-          <w:tblCellMar>
-            <w:top w:w="0" w:type="dxa"/>
-            <w:bottom w:w="0" w:type="dxa"/>
-          </w:tblCellMar>
-        </w:tblPrEx>
         <w:tc>
           <w:tcPr>
             <w:tcW w:w="2000" w:type="dxa"/>
@@ -3916,12 +3676,6 @@
         <w:gridCol w:w="3430"/>
       </w:tblGrid>
       <w:tr>
-        <w:tblPrEx>
-          <w:tblCellMar>
-            <w:top w:w="0" w:type="dxa"/>
-            <w:bottom w:w="0" w:type="dxa"/>
-          </w:tblCellMar>
-        </w:tblPrEx>
         <w:trPr>
           <w:tblHeader/>
         </w:trPr>
@@ -4026,12 +3780,6 @@
         </w:tc>
       </w:tr>
       <w:tr>
-        <w:tblPrEx>
-          <w:tblCellMar>
-            <w:top w:w="0" w:type="dxa"/>
-            <w:bottom w:w="0" w:type="dxa"/>
-          </w:tblCellMar>
-        </w:tblPrEx>
         <w:tc>
           <w:tcPr>
             <w:tcW w:w="2500" w:type="dxa"/>
@@ -4115,12 +3863,6 @@
         </w:tc>
       </w:tr>
       <w:tr>
-        <w:tblPrEx>
-          <w:tblCellMar>
-            <w:top w:w="0" w:type="dxa"/>
-            <w:bottom w:w="0" w:type="dxa"/>
-          </w:tblCellMar>
-        </w:tblPrEx>
         <w:tc>
           <w:tcPr>
             <w:tcW w:w="2500" w:type="dxa"/>
@@ -4204,12 +3946,6 @@
         </w:tc>
       </w:tr>
       <w:tr>
-        <w:tblPrEx>
-          <w:tblCellMar>
-            <w:top w:w="0" w:type="dxa"/>
-            <w:bottom w:w="0" w:type="dxa"/>
-          </w:tblCellMar>
-        </w:tblPrEx>
         <w:tc>
           <w:tcPr>
             <w:tcW w:w="2500" w:type="dxa"/>
@@ -4293,12 +4029,6 @@
         </w:tc>
       </w:tr>
       <w:tr>
-        <w:tblPrEx>
-          <w:tblCellMar>
-            <w:top w:w="0" w:type="dxa"/>
-            <w:bottom w:w="0" w:type="dxa"/>
-          </w:tblCellMar>
-        </w:tblPrEx>
         <w:tc>
           <w:tcPr>
             <w:tcW w:w="2500" w:type="dxa"/>
@@ -4382,12 +4112,6 @@
         </w:tc>
       </w:tr>
       <w:tr>
-        <w:tblPrEx>
-          <w:tblCellMar>
-            <w:top w:w="0" w:type="dxa"/>
-            <w:bottom w:w="0" w:type="dxa"/>
-          </w:tblCellMar>
-        </w:tblPrEx>
         <w:tc>
           <w:tcPr>
             <w:tcW w:w="2500" w:type="dxa"/>
@@ -4471,12 +4195,6 @@
         </w:tc>
       </w:tr>
       <w:tr>
-        <w:tblPrEx>
-          <w:tblCellMar>
-            <w:top w:w="0" w:type="dxa"/>
-            <w:bottom w:w="0" w:type="dxa"/>
-          </w:tblCellMar>
-        </w:tblPrEx>
         <w:tc>
           <w:tcPr>
             <w:tcW w:w="2500" w:type="dxa"/>
@@ -4560,12 +4278,6 @@
         </w:tc>
       </w:tr>
       <w:tr>
-        <w:tblPrEx>
-          <w:tblCellMar>
-            <w:top w:w="0" w:type="dxa"/>
-            <w:bottom w:w="0" w:type="dxa"/>
-          </w:tblCellMar>
-        </w:tblPrEx>
         <w:tc>
           <w:tcPr>
             <w:tcW w:w="2500" w:type="dxa"/>
@@ -4685,12 +4397,6 @@
         <w:gridCol w:w="3860"/>
       </w:tblGrid>
       <w:tr>
-        <w:tblPrEx>
-          <w:tblCellMar>
-            <w:top w:w="0" w:type="dxa"/>
-            <w:bottom w:w="0" w:type="dxa"/>
-          </w:tblCellMar>
-        </w:tblPrEx>
         <w:trPr>
           <w:tblHeader/>
         </w:trPr>
@@ -4795,12 +4501,6 @@
         </w:tc>
       </w:tr>
       <w:tr>
-        <w:tblPrEx>
-          <w:tblCellMar>
-            <w:top w:w="0" w:type="dxa"/>
-            <w:bottom w:w="0" w:type="dxa"/>
-          </w:tblCellMar>
-        </w:tblPrEx>
         <w:tc>
           <w:tcPr>
             <w:tcW w:w="2500" w:type="dxa"/>
@@ -4884,12 +4584,6 @@
         </w:tc>
       </w:tr>
       <w:tr>
-        <w:tblPrEx>
-          <w:tblCellMar>
-            <w:top w:w="0" w:type="dxa"/>
-            <w:bottom w:w="0" w:type="dxa"/>
-          </w:tblCellMar>
-        </w:tblPrEx>
         <w:tc>
           <w:tcPr>
             <w:tcW w:w="2500" w:type="dxa"/>
@@ -4973,12 +4667,6 @@
         </w:tc>
       </w:tr>
       <w:tr>
-        <w:tblPrEx>
-          <w:tblCellMar>
-            <w:top w:w="0" w:type="dxa"/>
-            <w:bottom w:w="0" w:type="dxa"/>
-          </w:tblCellMar>
-        </w:tblPrEx>
         <w:tc>
           <w:tcPr>
             <w:tcW w:w="2500" w:type="dxa"/>
@@ -5121,12 +4809,6 @@
         <w:gridCol w:w="7560"/>
       </w:tblGrid>
       <w:tr>
-        <w:tblPrEx>
-          <w:tblCellMar>
-            <w:top w:w="0" w:type="dxa"/>
-            <w:bottom w:w="0" w:type="dxa"/>
-          </w:tblCellMar>
-        </w:tblPrEx>
         <w:tc>
           <w:tcPr>
             <w:tcW w:w="1800" w:type="dxa"/>
@@ -5187,12 +4869,6 @@
         </w:tc>
       </w:tr>
       <w:tr>
-        <w:tblPrEx>
-          <w:tblCellMar>
-            <w:top w:w="0" w:type="dxa"/>
-            <w:bottom w:w="0" w:type="dxa"/>
-          </w:tblCellMar>
-        </w:tblPrEx>
         <w:tc>
           <w:tcPr>
             <w:tcW w:w="1800" w:type="dxa"/>
@@ -5251,12 +4927,6 @@
         </w:tc>
       </w:tr>
       <w:tr>
-        <w:tblPrEx>
-          <w:tblCellMar>
-            <w:top w:w="0" w:type="dxa"/>
-            <w:bottom w:w="0" w:type="dxa"/>
-          </w:tblCellMar>
-        </w:tblPrEx>
         <w:tc>
           <w:tcPr>
             <w:tcW w:w="1800" w:type="dxa"/>
@@ -5318,12 +4988,6 @@
         </w:tc>
       </w:tr>
       <w:tr>
-        <w:tblPrEx>
-          <w:tblCellMar>
-            <w:top w:w="0" w:type="dxa"/>
-            <w:bottom w:w="0" w:type="dxa"/>
-          </w:tblCellMar>
-        </w:tblPrEx>
         <w:tc>
           <w:tcPr>
             <w:tcW w:w="1800" w:type="dxa"/>
@@ -5448,12 +5112,6 @@
         <w:gridCol w:w="7560"/>
       </w:tblGrid>
       <w:tr>
-        <w:tblPrEx>
-          <w:tblCellMar>
-            <w:top w:w="0" w:type="dxa"/>
-            <w:bottom w:w="0" w:type="dxa"/>
-          </w:tblCellMar>
-        </w:tblPrEx>
         <w:tc>
           <w:tcPr>
             <w:tcW w:w="1800" w:type="dxa"/>
@@ -5514,12 +5172,6 @@
         </w:tc>
       </w:tr>
       <w:tr>
-        <w:tblPrEx>
-          <w:tblCellMar>
-            <w:top w:w="0" w:type="dxa"/>
-            <w:bottom w:w="0" w:type="dxa"/>
-          </w:tblCellMar>
-        </w:tblPrEx>
         <w:tc>
           <w:tcPr>
             <w:tcW w:w="1800" w:type="dxa"/>
@@ -5578,12 +5230,6 @@
         </w:tc>
       </w:tr>
       <w:tr>
-        <w:tblPrEx>
-          <w:tblCellMar>
-            <w:top w:w="0" w:type="dxa"/>
-            <w:bottom w:w="0" w:type="dxa"/>
-          </w:tblCellMar>
-        </w:tblPrEx>
         <w:tc>
           <w:tcPr>
             <w:tcW w:w="1800" w:type="dxa"/>
@@ -5645,12 +5291,6 @@
         </w:tc>
       </w:tr>
       <w:tr>
-        <w:tblPrEx>
-          <w:tblCellMar>
-            <w:top w:w="0" w:type="dxa"/>
-            <w:bottom w:w="0" w:type="dxa"/>
-          </w:tblCellMar>
-        </w:tblPrEx>
         <w:tc>
           <w:tcPr>
             <w:tcW w:w="1800" w:type="dxa"/>
@@ -5775,12 +5415,6 @@
         <w:gridCol w:w="7560"/>
       </w:tblGrid>
       <w:tr>
-        <w:tblPrEx>
-          <w:tblCellMar>
-            <w:top w:w="0" w:type="dxa"/>
-            <w:bottom w:w="0" w:type="dxa"/>
-          </w:tblCellMar>
-        </w:tblPrEx>
         <w:tc>
           <w:tcPr>
             <w:tcW w:w="1800" w:type="dxa"/>
@@ -5841,12 +5475,6 @@
         </w:tc>
       </w:tr>
       <w:tr>
-        <w:tblPrEx>
-          <w:tblCellMar>
-            <w:top w:w="0" w:type="dxa"/>
-            <w:bottom w:w="0" w:type="dxa"/>
-          </w:tblCellMar>
-        </w:tblPrEx>
         <w:tc>
           <w:tcPr>
             <w:tcW w:w="1800" w:type="dxa"/>
@@ -5905,12 +5533,6 @@
         </w:tc>
       </w:tr>
       <w:tr>
-        <w:tblPrEx>
-          <w:tblCellMar>
-            <w:top w:w="0" w:type="dxa"/>
-            <w:bottom w:w="0" w:type="dxa"/>
-          </w:tblCellMar>
-        </w:tblPrEx>
         <w:tc>
           <w:tcPr>
             <w:tcW w:w="1800" w:type="dxa"/>
@@ -5972,12 +5594,6 @@
         </w:tc>
       </w:tr>
       <w:tr>
-        <w:tblPrEx>
-          <w:tblCellMar>
-            <w:top w:w="0" w:type="dxa"/>
-            <w:bottom w:w="0" w:type="dxa"/>
-          </w:tblCellMar>
-        </w:tblPrEx>
         <w:tc>
           <w:tcPr>
             <w:tcW w:w="1800" w:type="dxa"/>
@@ -6103,12 +5719,6 @@
         <w:gridCol w:w="7560"/>
       </w:tblGrid>
       <w:tr>
-        <w:tblPrEx>
-          <w:tblCellMar>
-            <w:top w:w="0" w:type="dxa"/>
-            <w:bottom w:w="0" w:type="dxa"/>
-          </w:tblCellMar>
-        </w:tblPrEx>
         <w:tc>
           <w:tcPr>
             <w:tcW w:w="1800" w:type="dxa"/>
@@ -6169,12 +5779,6 @@
         </w:tc>
       </w:tr>
       <w:tr>
-        <w:tblPrEx>
-          <w:tblCellMar>
-            <w:top w:w="0" w:type="dxa"/>
-            <w:bottom w:w="0" w:type="dxa"/>
-          </w:tblCellMar>
-        </w:tblPrEx>
         <w:tc>
           <w:tcPr>
             <w:tcW w:w="1800" w:type="dxa"/>
@@ -6233,12 +5837,6 @@
         </w:tc>
       </w:tr>
       <w:tr>
-        <w:tblPrEx>
-          <w:tblCellMar>
-            <w:top w:w="0" w:type="dxa"/>
-            <w:bottom w:w="0" w:type="dxa"/>
-          </w:tblCellMar>
-        </w:tblPrEx>
         <w:tc>
           <w:tcPr>
             <w:tcW w:w="1800" w:type="dxa"/>
@@ -6300,12 +5898,6 @@
         </w:tc>
       </w:tr>
       <w:tr>
-        <w:tblPrEx>
-          <w:tblCellMar>
-            <w:top w:w="0" w:type="dxa"/>
-            <w:bottom w:w="0" w:type="dxa"/>
-          </w:tblCellMar>
-        </w:tblPrEx>
         <w:tc>
           <w:tcPr>
             <w:tcW w:w="1800" w:type="dxa"/>
@@ -6407,12 +5999,6 @@
         <w:gridCol w:w="7560"/>
       </w:tblGrid>
       <w:tr>
-        <w:tblPrEx>
-          <w:tblCellMar>
-            <w:top w:w="0" w:type="dxa"/>
-            <w:bottom w:w="0" w:type="dxa"/>
-          </w:tblCellMar>
-        </w:tblPrEx>
         <w:tc>
           <w:tcPr>
             <w:tcW w:w="1800" w:type="dxa"/>
@@ -6473,12 +6059,6 @@
         </w:tc>
       </w:tr>
       <w:tr>
-        <w:tblPrEx>
-          <w:tblCellMar>
-            <w:top w:w="0" w:type="dxa"/>
-            <w:bottom w:w="0" w:type="dxa"/>
-          </w:tblCellMar>
-        </w:tblPrEx>
         <w:tc>
           <w:tcPr>
             <w:tcW w:w="1800" w:type="dxa"/>
@@ -6537,12 +6117,6 @@
         </w:tc>
       </w:tr>
       <w:tr>
-        <w:tblPrEx>
-          <w:tblCellMar>
-            <w:top w:w="0" w:type="dxa"/>
-            <w:bottom w:w="0" w:type="dxa"/>
-          </w:tblCellMar>
-        </w:tblPrEx>
         <w:tc>
           <w:tcPr>
             <w:tcW w:w="1800" w:type="dxa"/>
@@ -6604,12 +6178,6 @@
         </w:tc>
       </w:tr>
       <w:tr>
-        <w:tblPrEx>
-          <w:tblCellMar>
-            <w:top w:w="0" w:type="dxa"/>
-            <w:bottom w:w="0" w:type="dxa"/>
-          </w:tblCellMar>
-        </w:tblPrEx>
         <w:tc>
           <w:tcPr>
             <w:tcW w:w="1800" w:type="dxa"/>
@@ -6711,12 +6279,6 @@
         <w:gridCol w:w="7560"/>
       </w:tblGrid>
       <w:tr>
-        <w:tblPrEx>
-          <w:tblCellMar>
-            <w:top w:w="0" w:type="dxa"/>
-            <w:bottom w:w="0" w:type="dxa"/>
-          </w:tblCellMar>
-        </w:tblPrEx>
         <w:tc>
           <w:tcPr>
             <w:tcW w:w="1800" w:type="dxa"/>
@@ -6777,12 +6339,6 @@
         </w:tc>
       </w:tr>
       <w:tr>
-        <w:tblPrEx>
-          <w:tblCellMar>
-            <w:top w:w="0" w:type="dxa"/>
-            <w:bottom w:w="0" w:type="dxa"/>
-          </w:tblCellMar>
-        </w:tblPrEx>
         <w:tc>
           <w:tcPr>
             <w:tcW w:w="1800" w:type="dxa"/>
@@ -6841,12 +6397,6 @@
         </w:tc>
       </w:tr>
       <w:tr>
-        <w:tblPrEx>
-          <w:tblCellMar>
-            <w:top w:w="0" w:type="dxa"/>
-            <w:bottom w:w="0" w:type="dxa"/>
-          </w:tblCellMar>
-        </w:tblPrEx>
         <w:tc>
           <w:tcPr>
             <w:tcW w:w="1800" w:type="dxa"/>
@@ -6908,12 +6458,6 @@
         </w:tc>
       </w:tr>
       <w:tr>
-        <w:tblPrEx>
-          <w:tblCellMar>
-            <w:top w:w="0" w:type="dxa"/>
-            <w:bottom w:w="0" w:type="dxa"/>
-          </w:tblCellMar>
-        </w:tblPrEx>
         <w:tc>
           <w:tcPr>
             <w:tcW w:w="1800" w:type="dxa"/>
@@ -7039,12 +6583,6 @@
         <w:gridCol w:w="7560"/>
       </w:tblGrid>
       <w:tr>
-        <w:tblPrEx>
-          <w:tblCellMar>
-            <w:top w:w="0" w:type="dxa"/>
-            <w:bottom w:w="0" w:type="dxa"/>
-          </w:tblCellMar>
-        </w:tblPrEx>
         <w:tc>
           <w:tcPr>
             <w:tcW w:w="1800" w:type="dxa"/>
@@ -7105,12 +6643,6 @@
         </w:tc>
       </w:tr>
       <w:tr>
-        <w:tblPrEx>
-          <w:tblCellMar>
-            <w:top w:w="0" w:type="dxa"/>
-            <w:bottom w:w="0" w:type="dxa"/>
-          </w:tblCellMar>
-        </w:tblPrEx>
         <w:tc>
           <w:tcPr>
             <w:tcW w:w="1800" w:type="dxa"/>
@@ -7169,12 +6701,6 @@
         </w:tc>
       </w:tr>
       <w:tr>
-        <w:tblPrEx>
-          <w:tblCellMar>
-            <w:top w:w="0" w:type="dxa"/>
-            <w:bottom w:w="0" w:type="dxa"/>
-          </w:tblCellMar>
-        </w:tblPrEx>
         <w:tc>
           <w:tcPr>
             <w:tcW w:w="1800" w:type="dxa"/>
@@ -7236,12 +6762,6 @@
         </w:tc>
       </w:tr>
       <w:tr>
-        <w:tblPrEx>
-          <w:tblCellMar>
-            <w:top w:w="0" w:type="dxa"/>
-            <w:bottom w:w="0" w:type="dxa"/>
-          </w:tblCellMar>
-        </w:tblPrEx>
         <w:tc>
           <w:tcPr>
             <w:tcW w:w="1800" w:type="dxa"/>
@@ -7410,12 +6930,6 @@
         <w:gridCol w:w="7560"/>
       </w:tblGrid>
       <w:tr>
-        <w:tblPrEx>
-          <w:tblCellMar>
-            <w:top w:w="0" w:type="dxa"/>
-            <w:bottom w:w="0" w:type="dxa"/>
-          </w:tblCellMar>
-        </w:tblPrEx>
         <w:tc>
           <w:tcPr>
             <w:tcW w:w="1800" w:type="dxa"/>
@@ -7476,12 +6990,6 @@
         </w:tc>
       </w:tr>
       <w:tr>
-        <w:tblPrEx>
-          <w:tblCellMar>
-            <w:top w:w="0" w:type="dxa"/>
-            <w:bottom w:w="0" w:type="dxa"/>
-          </w:tblCellMar>
-        </w:tblPrEx>
         <w:tc>
           <w:tcPr>
             <w:tcW w:w="1800" w:type="dxa"/>
@@ -7540,12 +7048,6 @@
         </w:tc>
       </w:tr>
       <w:tr>
-        <w:tblPrEx>
-          <w:tblCellMar>
-            <w:top w:w="0" w:type="dxa"/>
-            <w:bottom w:w="0" w:type="dxa"/>
-          </w:tblCellMar>
-        </w:tblPrEx>
         <w:tc>
           <w:tcPr>
             <w:tcW w:w="1800" w:type="dxa"/>
@@ -7607,12 +7109,6 @@
         </w:tc>
       </w:tr>
       <w:tr>
-        <w:tblPrEx>
-          <w:tblCellMar>
-            <w:top w:w="0" w:type="dxa"/>
-            <w:bottom w:w="0" w:type="dxa"/>
-          </w:tblCellMar>
-        </w:tblPrEx>
         <w:tc>
           <w:tcPr>
             <w:tcW w:w="1800" w:type="dxa"/>
@@ -7725,12 +7221,6 @@
         <w:gridCol w:w="7560"/>
       </w:tblGrid>
       <w:tr>
-        <w:tblPrEx>
-          <w:tblCellMar>
-            <w:top w:w="0" w:type="dxa"/>
-            <w:bottom w:w="0" w:type="dxa"/>
-          </w:tblCellMar>
-        </w:tblPrEx>
         <w:tc>
           <w:tcPr>
             <w:tcW w:w="1800" w:type="dxa"/>
@@ -7791,12 +7281,6 @@
         </w:tc>
       </w:tr>
       <w:tr>
-        <w:tblPrEx>
-          <w:tblCellMar>
-            <w:top w:w="0" w:type="dxa"/>
-            <w:bottom w:w="0" w:type="dxa"/>
-          </w:tblCellMar>
-        </w:tblPrEx>
         <w:tc>
           <w:tcPr>
             <w:tcW w:w="1800" w:type="dxa"/>
@@ -7855,12 +7339,6 @@
         </w:tc>
       </w:tr>
       <w:tr>
-        <w:tblPrEx>
-          <w:tblCellMar>
-            <w:top w:w="0" w:type="dxa"/>
-            <w:bottom w:w="0" w:type="dxa"/>
-          </w:tblCellMar>
-        </w:tblPrEx>
         <w:tc>
           <w:tcPr>
             <w:tcW w:w="1800" w:type="dxa"/>
@@ -7922,12 +7400,6 @@
         </w:tc>
       </w:tr>
       <w:tr>
-        <w:tblPrEx>
-          <w:tblCellMar>
-            <w:top w:w="0" w:type="dxa"/>
-            <w:bottom w:w="0" w:type="dxa"/>
-          </w:tblCellMar>
-        </w:tblPrEx>
         <w:tc>
           <w:tcPr>
             <w:tcW w:w="1800" w:type="dxa"/>
@@ -8065,12 +7537,6 @@
         <w:gridCol w:w="7560"/>
       </w:tblGrid>
       <w:tr>
-        <w:tblPrEx>
-          <w:tblCellMar>
-            <w:top w:w="0" w:type="dxa"/>
-            <w:bottom w:w="0" w:type="dxa"/>
-          </w:tblCellMar>
-        </w:tblPrEx>
         <w:tc>
           <w:tcPr>
             <w:tcW w:w="1800" w:type="dxa"/>
@@ -8131,12 +7597,6 @@
         </w:tc>
       </w:tr>
       <w:tr>
-        <w:tblPrEx>
-          <w:tblCellMar>
-            <w:top w:w="0" w:type="dxa"/>
-            <w:bottom w:w="0" w:type="dxa"/>
-          </w:tblCellMar>
-        </w:tblPrEx>
         <w:tc>
           <w:tcPr>
             <w:tcW w:w="1800" w:type="dxa"/>
@@ -8195,12 +7655,6 @@
         </w:tc>
       </w:tr>
       <w:tr>
-        <w:tblPrEx>
-          <w:tblCellMar>
-            <w:top w:w="0" w:type="dxa"/>
-            <w:bottom w:w="0" w:type="dxa"/>
-          </w:tblCellMar>
-        </w:tblPrEx>
         <w:tc>
           <w:tcPr>
             <w:tcW w:w="1800" w:type="dxa"/>
@@ -8262,12 +7716,6 @@
         </w:tc>
       </w:tr>
       <w:tr>
-        <w:tblPrEx>
-          <w:tblCellMar>
-            <w:top w:w="0" w:type="dxa"/>
-            <w:bottom w:w="0" w:type="dxa"/>
-          </w:tblCellMar>
-        </w:tblPrEx>
         <w:tc>
           <w:tcPr>
             <w:tcW w:w="1800" w:type="dxa"/>
@@ -8368,12 +7816,6 @@
         <w:gridCol w:w="7560"/>
       </w:tblGrid>
       <w:tr>
-        <w:tblPrEx>
-          <w:tblCellMar>
-            <w:top w:w="0" w:type="dxa"/>
-            <w:bottom w:w="0" w:type="dxa"/>
-          </w:tblCellMar>
-        </w:tblPrEx>
         <w:tc>
           <w:tcPr>
             <w:tcW w:w="1800" w:type="dxa"/>
@@ -8434,12 +7876,6 @@
         </w:tc>
       </w:tr>
       <w:tr>
-        <w:tblPrEx>
-          <w:tblCellMar>
-            <w:top w:w="0" w:type="dxa"/>
-            <w:bottom w:w="0" w:type="dxa"/>
-          </w:tblCellMar>
-        </w:tblPrEx>
         <w:tc>
           <w:tcPr>
             <w:tcW w:w="1800" w:type="dxa"/>
@@ -8498,12 +7934,6 @@
         </w:tc>
       </w:tr>
       <w:tr>
-        <w:tblPrEx>
-          <w:tblCellMar>
-            <w:top w:w="0" w:type="dxa"/>
-            <w:bottom w:w="0" w:type="dxa"/>
-          </w:tblCellMar>
-        </w:tblPrEx>
         <w:tc>
           <w:tcPr>
             <w:tcW w:w="1800" w:type="dxa"/>
@@ -8565,12 +7995,6 @@
         </w:tc>
       </w:tr>
       <w:tr>
-        <w:tblPrEx>
-          <w:tblCellMar>
-            <w:top w:w="0" w:type="dxa"/>
-            <w:bottom w:w="0" w:type="dxa"/>
-          </w:tblCellMar>
-        </w:tblPrEx>
         <w:tc>
           <w:tcPr>
             <w:tcW w:w="1800" w:type="dxa"/>
@@ -8673,12 +8097,6 @@
         <w:gridCol w:w="7560"/>
       </w:tblGrid>
       <w:tr>
-        <w:tblPrEx>
-          <w:tblCellMar>
-            <w:top w:w="0" w:type="dxa"/>
-            <w:bottom w:w="0" w:type="dxa"/>
-          </w:tblCellMar>
-        </w:tblPrEx>
         <w:tc>
           <w:tcPr>
             <w:tcW w:w="1800" w:type="dxa"/>
@@ -8739,12 +8157,6 @@
         </w:tc>
       </w:tr>
       <w:tr>
-        <w:tblPrEx>
-          <w:tblCellMar>
-            <w:top w:w="0" w:type="dxa"/>
-            <w:bottom w:w="0" w:type="dxa"/>
-          </w:tblCellMar>
-        </w:tblPrEx>
         <w:tc>
           <w:tcPr>
             <w:tcW w:w="1800" w:type="dxa"/>
@@ -8803,12 +8215,6 @@
         </w:tc>
       </w:tr>
       <w:tr>
-        <w:tblPrEx>
-          <w:tblCellMar>
-            <w:top w:w="0" w:type="dxa"/>
-            <w:bottom w:w="0" w:type="dxa"/>
-          </w:tblCellMar>
-        </w:tblPrEx>
         <w:tc>
           <w:tcPr>
             <w:tcW w:w="1800" w:type="dxa"/>
@@ -8870,12 +8276,6 @@
         </w:tc>
       </w:tr>
       <w:tr>
-        <w:tblPrEx>
-          <w:tblCellMar>
-            <w:top w:w="0" w:type="dxa"/>
-            <w:bottom w:w="0" w:type="dxa"/>
-          </w:tblCellMar>
-        </w:tblPrEx>
         <w:tc>
           <w:tcPr>
             <w:tcW w:w="1800" w:type="dxa"/>
@@ -9013,12 +8413,6 @@
         <w:gridCol w:w="7560"/>
       </w:tblGrid>
       <w:tr>
-        <w:tblPrEx>
-          <w:tblCellMar>
-            <w:top w:w="0" w:type="dxa"/>
-            <w:bottom w:w="0" w:type="dxa"/>
-          </w:tblCellMar>
-        </w:tblPrEx>
         <w:tc>
           <w:tcPr>
             <w:tcW w:w="1800" w:type="dxa"/>
@@ -9079,12 +8473,6 @@
         </w:tc>
       </w:tr>
       <w:tr>
-        <w:tblPrEx>
-          <w:tblCellMar>
-            <w:top w:w="0" w:type="dxa"/>
-            <w:bottom w:w="0" w:type="dxa"/>
-          </w:tblCellMar>
-        </w:tblPrEx>
         <w:tc>
           <w:tcPr>
             <w:tcW w:w="1800" w:type="dxa"/>
@@ -9143,12 +8531,6 @@
         </w:tc>
       </w:tr>
       <w:tr>
-        <w:tblPrEx>
-          <w:tblCellMar>
-            <w:top w:w="0" w:type="dxa"/>
-            <w:bottom w:w="0" w:type="dxa"/>
-          </w:tblCellMar>
-        </w:tblPrEx>
         <w:tc>
           <w:tcPr>
             <w:tcW w:w="1800" w:type="dxa"/>
@@ -9210,12 +8592,6 @@
         </w:tc>
       </w:tr>
       <w:tr>
-        <w:tblPrEx>
-          <w:tblCellMar>
-            <w:top w:w="0" w:type="dxa"/>
-            <w:bottom w:w="0" w:type="dxa"/>
-          </w:tblCellMar>
-        </w:tblPrEx>
         <w:tc>
           <w:tcPr>
             <w:tcW w:w="1800" w:type="dxa"/>
@@ -9341,12 +8717,6 @@
         <w:gridCol w:w="7560"/>
       </w:tblGrid>
       <w:tr>
-        <w:tblPrEx>
-          <w:tblCellMar>
-            <w:top w:w="0" w:type="dxa"/>
-            <w:bottom w:w="0" w:type="dxa"/>
-          </w:tblCellMar>
-        </w:tblPrEx>
         <w:tc>
           <w:tcPr>
             <w:tcW w:w="1800" w:type="dxa"/>
@@ -9407,12 +8777,6 @@
         </w:tc>
       </w:tr>
       <w:tr>
-        <w:tblPrEx>
-          <w:tblCellMar>
-            <w:top w:w="0" w:type="dxa"/>
-            <w:bottom w:w="0" w:type="dxa"/>
-          </w:tblCellMar>
-        </w:tblPrEx>
         <w:tc>
           <w:tcPr>
             <w:tcW w:w="1800" w:type="dxa"/>
@@ -9471,12 +8835,6 @@
         </w:tc>
       </w:tr>
       <w:tr>
-        <w:tblPrEx>
-          <w:tblCellMar>
-            <w:top w:w="0" w:type="dxa"/>
-            <w:bottom w:w="0" w:type="dxa"/>
-          </w:tblCellMar>
-        </w:tblPrEx>
         <w:tc>
           <w:tcPr>
             <w:tcW w:w="1800" w:type="dxa"/>
@@ -9538,12 +8896,6 @@
         </w:tc>
       </w:tr>
       <w:tr>
-        <w:tblPrEx>
-          <w:tblCellMar>
-            <w:top w:w="0" w:type="dxa"/>
-            <w:bottom w:w="0" w:type="dxa"/>
-          </w:tblCellMar>
-        </w:tblPrEx>
         <w:tc>
           <w:tcPr>
             <w:tcW w:w="1800" w:type="dxa"/>
@@ -9656,12 +9008,6 @@
         <w:gridCol w:w="7560"/>
       </w:tblGrid>
       <w:tr>
-        <w:tblPrEx>
-          <w:tblCellMar>
-            <w:top w:w="0" w:type="dxa"/>
-            <w:bottom w:w="0" w:type="dxa"/>
-          </w:tblCellMar>
-        </w:tblPrEx>
         <w:tc>
           <w:tcPr>
             <w:tcW w:w="1800" w:type="dxa"/>
@@ -9722,12 +9068,6 @@
         </w:tc>
       </w:tr>
       <w:tr>
-        <w:tblPrEx>
-          <w:tblCellMar>
-            <w:top w:w="0" w:type="dxa"/>
-            <w:bottom w:w="0" w:type="dxa"/>
-          </w:tblCellMar>
-        </w:tblPrEx>
         <w:tc>
           <w:tcPr>
             <w:tcW w:w="1800" w:type="dxa"/>
@@ -9786,12 +9126,6 @@
         </w:tc>
       </w:tr>
       <w:tr>
-        <w:tblPrEx>
-          <w:tblCellMar>
-            <w:top w:w="0" w:type="dxa"/>
-            <w:bottom w:w="0" w:type="dxa"/>
-          </w:tblCellMar>
-        </w:tblPrEx>
         <w:tc>
           <w:tcPr>
             <w:tcW w:w="1800" w:type="dxa"/>
@@ -9853,12 +9187,6 @@
         </w:tc>
       </w:tr>
       <w:tr>
-        <w:tblPrEx>
-          <w:tblCellMar>
-            <w:top w:w="0" w:type="dxa"/>
-            <w:bottom w:w="0" w:type="dxa"/>
-          </w:tblCellMar>
-        </w:tblPrEx>
         <w:tc>
           <w:tcPr>
             <w:tcW w:w="1800" w:type="dxa"/>
@@ -10000,12 +9328,6 @@
         <w:gridCol w:w="2930"/>
       </w:tblGrid>
       <w:tr>
-        <w:tblPrEx>
-          <w:tblCellMar>
-            <w:top w:w="0" w:type="dxa"/>
-            <w:bottom w:w="0" w:type="dxa"/>
-          </w:tblCellMar>
-        </w:tblPrEx>
         <w:trPr>
           <w:tblHeader/>
         </w:trPr>
@@ -10110,12 +9432,6 @@
         </w:tc>
       </w:tr>
       <w:tr>
-        <w:tblPrEx>
-          <w:tblCellMar>
-            <w:top w:w="0" w:type="dxa"/>
-            <w:bottom w:w="0" w:type="dxa"/>
-          </w:tblCellMar>
-        </w:tblPrEx>
         <w:tc>
           <w:tcPr>
             <w:tcW w:w="3500" w:type="dxa"/>
@@ -10199,12 +9515,6 @@
         </w:tc>
       </w:tr>
       <w:tr>
-        <w:tblPrEx>
-          <w:tblCellMar>
-            <w:top w:w="0" w:type="dxa"/>
-            <w:bottom w:w="0" w:type="dxa"/>
-          </w:tblCellMar>
-        </w:tblPrEx>
         <w:tc>
           <w:tcPr>
             <w:tcW w:w="3500" w:type="dxa"/>
@@ -10288,12 +9598,6 @@
         </w:tc>
       </w:tr>
       <w:tr>
-        <w:tblPrEx>
-          <w:tblCellMar>
-            <w:top w:w="0" w:type="dxa"/>
-            <w:bottom w:w="0" w:type="dxa"/>
-          </w:tblCellMar>
-        </w:tblPrEx>
         <w:tc>
           <w:tcPr>
             <w:tcW w:w="3500" w:type="dxa"/>
@@ -10377,12 +9681,6 @@
         </w:tc>
       </w:tr>
       <w:tr>
-        <w:tblPrEx>
-          <w:tblCellMar>
-            <w:top w:w="0" w:type="dxa"/>
-            <w:bottom w:w="0" w:type="dxa"/>
-          </w:tblCellMar>
-        </w:tblPrEx>
         <w:tc>
           <w:tcPr>
             <w:tcW w:w="3500" w:type="dxa"/>
@@ -10466,12 +9764,6 @@
         </w:tc>
       </w:tr>
       <w:tr>
-        <w:tblPrEx>
-          <w:tblCellMar>
-            <w:top w:w="0" w:type="dxa"/>
-            <w:bottom w:w="0" w:type="dxa"/>
-          </w:tblCellMar>
-        </w:tblPrEx>
         <w:tc>
           <w:tcPr>
             <w:tcW w:w="3500" w:type="dxa"/>
@@ -10900,12 +10192,6 @@
         <w:gridCol w:w="6360"/>
       </w:tblGrid>
       <w:tr>
-        <w:tblPrEx>
-          <w:tblCellMar>
-            <w:top w:w="0" w:type="dxa"/>
-            <w:bottom w:w="0" w:type="dxa"/>
-          </w:tblCellMar>
-        </w:tblPrEx>
         <w:trPr>
           <w:tblHeader/>
         </w:trPr>
@@ -10977,12 +10263,6 @@
         </w:tc>
       </w:tr>
       <w:tr>
-        <w:tblPrEx>
-          <w:tblCellMar>
-            <w:top w:w="0" w:type="dxa"/>
-            <w:bottom w:w="0" w:type="dxa"/>
-          </w:tblCellMar>
-        </w:tblPrEx>
         <w:tc>
           <w:tcPr>
             <w:tcW w:w="3000" w:type="dxa"/>
@@ -11039,12 +10319,6 @@
         </w:tc>
       </w:tr>
       <w:tr>
-        <w:tblPrEx>
-          <w:tblCellMar>
-            <w:top w:w="0" w:type="dxa"/>
-            <w:bottom w:w="0" w:type="dxa"/>
-          </w:tblCellMar>
-        </w:tblPrEx>
         <w:tc>
           <w:tcPr>
             <w:tcW w:w="3000" w:type="dxa"/>
@@ -11101,12 +10375,6 @@
         </w:tc>
       </w:tr>
       <w:tr>
-        <w:tblPrEx>
-          <w:tblCellMar>
-            <w:top w:w="0" w:type="dxa"/>
-            <w:bottom w:w="0" w:type="dxa"/>
-          </w:tblCellMar>
-        </w:tblPrEx>
         <w:tc>
           <w:tcPr>
             <w:tcW w:w="3000" w:type="dxa"/>
@@ -11163,12 +10431,6 @@
         </w:tc>
       </w:tr>
       <w:tr>
-        <w:tblPrEx>
-          <w:tblCellMar>
-            <w:top w:w="0" w:type="dxa"/>
-            <w:bottom w:w="0" w:type="dxa"/>
-          </w:tblCellMar>
-        </w:tblPrEx>
         <w:tc>
           <w:tcPr>
             <w:tcW w:w="3000" w:type="dxa"/>
@@ -11225,12 +10487,6 @@
         </w:tc>
       </w:tr>
       <w:tr>
-        <w:tblPrEx>
-          <w:tblCellMar>
-            <w:top w:w="0" w:type="dxa"/>
-            <w:bottom w:w="0" w:type="dxa"/>
-          </w:tblCellMar>
-        </w:tblPrEx>
         <w:tc>
           <w:tcPr>
             <w:tcW w:w="3000" w:type="dxa"/>
@@ -11464,12 +10720,6 @@
         <w:gridCol w:w="2660"/>
       </w:tblGrid>
       <w:tr>
-        <w:tblPrEx>
-          <w:tblCellMar>
-            <w:top w:w="0" w:type="dxa"/>
-            <w:bottom w:w="0" w:type="dxa"/>
-          </w:tblCellMar>
-        </w:tblPrEx>
         <w:trPr>
           <w:tblHeader/>
         </w:trPr>
@@ -11574,12 +10824,6 @@
         </w:tc>
       </w:tr>
       <w:tr>
-        <w:tblPrEx>
-          <w:tblCellMar>
-            <w:top w:w="0" w:type="dxa"/>
-            <w:bottom w:w="0" w:type="dxa"/>
-          </w:tblCellMar>
-        </w:tblPrEx>
         <w:tc>
           <w:tcPr>
             <w:tcW w:w="3000" w:type="dxa"/>
@@ -11663,12 +10907,6 @@
         </w:tc>
       </w:tr>
       <w:tr>
-        <w:tblPrEx>
-          <w:tblCellMar>
-            <w:top w:w="0" w:type="dxa"/>
-            <w:bottom w:w="0" w:type="dxa"/>
-          </w:tblCellMar>
-        </w:tblPrEx>
         <w:tc>
           <w:tcPr>
             <w:tcW w:w="3000" w:type="dxa"/>
@@ -11752,12 +10990,6 @@
         </w:tc>
       </w:tr>
       <w:tr>
-        <w:tblPrEx>
-          <w:tblCellMar>
-            <w:top w:w="0" w:type="dxa"/>
-            <w:bottom w:w="0" w:type="dxa"/>
-          </w:tblCellMar>
-        </w:tblPrEx>
         <w:tc>
           <w:tcPr>
             <w:tcW w:w="3000" w:type="dxa"/>
@@ -11841,12 +11073,6 @@
         </w:tc>
       </w:tr>
       <w:tr>
-        <w:tblPrEx>
-          <w:tblCellMar>
-            <w:top w:w="0" w:type="dxa"/>
-            <w:bottom w:w="0" w:type="dxa"/>
-          </w:tblCellMar>
-        </w:tblPrEx>
         <w:tc>
           <w:tcPr>
             <w:tcW w:w="3000" w:type="dxa"/>
@@ -11930,12 +11156,6 @@
         </w:tc>
       </w:tr>
       <w:tr>
-        <w:tblPrEx>
-          <w:tblCellMar>
-            <w:top w:w="0" w:type="dxa"/>
-            <w:bottom w:w="0" w:type="dxa"/>
-          </w:tblCellMar>
-        </w:tblPrEx>
         <w:tc>
           <w:tcPr>
             <w:tcW w:w="3000" w:type="dxa"/>
@@ -12019,12 +11239,6 @@
         </w:tc>
       </w:tr>
       <w:tr>
-        <w:tblPrEx>
-          <w:tblCellMar>
-            <w:top w:w="0" w:type="dxa"/>
-            <w:bottom w:w="0" w:type="dxa"/>
-          </w:tblCellMar>
-        </w:tblPrEx>
         <w:tc>
           <w:tcPr>
             <w:tcW w:w="3000" w:type="dxa"/>
@@ -12108,12 +11322,6 @@
         </w:tc>
       </w:tr>
       <w:tr>
-        <w:tblPrEx>
-          <w:tblCellMar>
-            <w:top w:w="0" w:type="dxa"/>
-            <w:bottom w:w="0" w:type="dxa"/>
-          </w:tblCellMar>
-        </w:tblPrEx>
         <w:tc>
           <w:tcPr>
             <w:tcW w:w="3000" w:type="dxa"/>
@@ -12197,12 +11405,6 @@
         </w:tc>
       </w:tr>
       <w:tr>
-        <w:tblPrEx>
-          <w:tblCellMar>
-            <w:top w:w="0" w:type="dxa"/>
-            <w:bottom w:w="0" w:type="dxa"/>
-          </w:tblCellMar>
-        </w:tblPrEx>
         <w:tc>
           <w:tcPr>
             <w:tcW w:w="3000" w:type="dxa"/>
@@ -12286,12 +11488,6 @@
         </w:tc>
       </w:tr>
       <w:tr>
-        <w:tblPrEx>
-          <w:tblCellMar>
-            <w:top w:w="0" w:type="dxa"/>
-            <w:bottom w:w="0" w:type="dxa"/>
-          </w:tblCellMar>
-        </w:tblPrEx>
         <w:tc>
           <w:tcPr>
             <w:tcW w:w="3000" w:type="dxa"/>
@@ -12375,12 +11571,6 @@
         </w:tc>
       </w:tr>
       <w:tr>
-        <w:tblPrEx>
-          <w:tblCellMar>
-            <w:top w:w="0" w:type="dxa"/>
-            <w:bottom w:w="0" w:type="dxa"/>
-          </w:tblCellMar>
-        </w:tblPrEx>
         <w:tc>
           <w:tcPr>
             <w:tcW w:w="3000" w:type="dxa"/>
@@ -12464,12 +11654,6 @@
         </w:tc>
       </w:tr>
       <w:tr>
-        <w:tblPrEx>
-          <w:tblCellMar>
-            <w:top w:w="0" w:type="dxa"/>
-            <w:bottom w:w="0" w:type="dxa"/>
-          </w:tblCellMar>
-        </w:tblPrEx>
         <w:tc>
           <w:tcPr>
             <w:tcW w:w="3000" w:type="dxa"/>
@@ -12829,12 +12013,6 @@
         <w:gridCol w:w="3430"/>
       </w:tblGrid>
       <w:tr>
-        <w:tblPrEx>
-          <w:tblCellMar>
-            <w:top w:w="0" w:type="dxa"/>
-            <w:bottom w:w="0" w:type="dxa"/>
-          </w:tblCellMar>
-        </w:tblPrEx>
         <w:trPr>
           <w:tblHeader/>
         </w:trPr>
@@ -12939,12 +12117,6 @@
         </w:tc>
       </w:tr>
       <w:tr>
-        <w:tblPrEx>
-          <w:tblCellMar>
-            <w:top w:w="0" w:type="dxa"/>
-            <w:bottom w:w="0" w:type="dxa"/>
-          </w:tblCellMar>
-        </w:tblPrEx>
         <w:tc>
           <w:tcPr>
             <w:tcW w:w="2500" w:type="dxa"/>
@@ -13028,12 +12200,6 @@
         </w:tc>
       </w:tr>
       <w:tr>
-        <w:tblPrEx>
-          <w:tblCellMar>
-            <w:top w:w="0" w:type="dxa"/>
-            <w:bottom w:w="0" w:type="dxa"/>
-          </w:tblCellMar>
-        </w:tblPrEx>
         <w:tc>
           <w:tcPr>
             <w:tcW w:w="2500" w:type="dxa"/>
@@ -13117,12 +12283,6 @@
         </w:tc>
       </w:tr>
       <w:tr>
-        <w:tblPrEx>
-          <w:tblCellMar>
-            <w:top w:w="0" w:type="dxa"/>
-            <w:bottom w:w="0" w:type="dxa"/>
-          </w:tblCellMar>
-        </w:tblPrEx>
         <w:tc>
           <w:tcPr>
             <w:tcW w:w="2500" w:type="dxa"/>
@@ -13206,12 +12366,6 @@
         </w:tc>
       </w:tr>
       <w:tr>
-        <w:tblPrEx>
-          <w:tblCellMar>
-            <w:top w:w="0" w:type="dxa"/>
-            <w:bottom w:w="0" w:type="dxa"/>
-          </w:tblCellMar>
-        </w:tblPrEx>
         <w:tc>
           <w:tcPr>
             <w:tcW w:w="2500" w:type="dxa"/>
@@ -13350,12 +12504,6 @@
         <w:gridCol w:w="4560"/>
       </w:tblGrid>
       <w:tr>
-        <w:tblPrEx>
-          <w:tblCellMar>
-            <w:top w:w="0" w:type="dxa"/>
-            <w:bottom w:w="0" w:type="dxa"/>
-          </w:tblCellMar>
-        </w:tblPrEx>
         <w:trPr>
           <w:tblHeader/>
         </w:trPr>
@@ -13460,12 +12608,6 @@
         </w:tc>
       </w:tr>
       <w:tr>
-        <w:tblPrEx>
-          <w:tblCellMar>
-            <w:top w:w="0" w:type="dxa"/>
-            <w:bottom w:w="0" w:type="dxa"/>
-          </w:tblCellMar>
-        </w:tblPrEx>
         <w:tc>
           <w:tcPr>
             <w:tcW w:w="1800" w:type="dxa"/>
@@ -13549,12 +12691,6 @@
         </w:tc>
       </w:tr>
       <w:tr>
-        <w:tblPrEx>
-          <w:tblCellMar>
-            <w:top w:w="0" w:type="dxa"/>
-            <w:bottom w:w="0" w:type="dxa"/>
-          </w:tblCellMar>
-        </w:tblPrEx>
         <w:tc>
           <w:tcPr>
             <w:tcW w:w="1800" w:type="dxa"/>
@@ -13638,12 +12774,6 @@
         </w:tc>
       </w:tr>
       <w:tr>
-        <w:tblPrEx>
-          <w:tblCellMar>
-            <w:top w:w="0" w:type="dxa"/>
-            <w:bottom w:w="0" w:type="dxa"/>
-          </w:tblCellMar>
-        </w:tblPrEx>
         <w:tc>
           <w:tcPr>
             <w:tcW w:w="1800" w:type="dxa"/>
@@ -13727,12 +12857,6 @@
         </w:tc>
       </w:tr>
       <w:tr>
-        <w:tblPrEx>
-          <w:tblCellMar>
-            <w:top w:w="0" w:type="dxa"/>
-            <w:bottom w:w="0" w:type="dxa"/>
-          </w:tblCellMar>
-        </w:tblPrEx>
         <w:tc>
           <w:tcPr>
             <w:tcW w:w="1800" w:type="dxa"/>
@@ -13853,12 +12977,6 @@
         <w:gridCol w:w="2400"/>
       </w:tblGrid>
       <w:tr>
-        <w:tblPrEx>
-          <w:tblCellMar>
-            <w:top w:w="0" w:type="dxa"/>
-            <w:bottom w:w="0" w:type="dxa"/>
-          </w:tblCellMar>
-        </w:tblPrEx>
         <w:trPr>
           <w:tblHeader/>
         </w:trPr>
@@ -13996,12 +13114,6 @@
         </w:tc>
       </w:tr>
       <w:tr>
-        <w:tblPrEx>
-          <w:tblCellMar>
-            <w:top w:w="0" w:type="dxa"/>
-            <w:bottom w:w="0" w:type="dxa"/>
-          </w:tblCellMar>
-        </w:tblPrEx>
         <w:tc>
           <w:tcPr>
             <w:tcW w:w="2200" w:type="dxa"/>
@@ -14112,12 +13224,6 @@
         </w:tc>
       </w:tr>
       <w:tr>
-        <w:tblPrEx>
-          <w:tblCellMar>
-            <w:top w:w="0" w:type="dxa"/>
-            <w:bottom w:w="0" w:type="dxa"/>
-          </w:tblCellMar>
-        </w:tblPrEx>
         <w:tc>
           <w:tcPr>
             <w:tcW w:w="2200" w:type="dxa"/>
@@ -14228,12 +13334,6 @@
         </w:tc>
       </w:tr>
       <w:tr>
-        <w:tblPrEx>
-          <w:tblCellMar>
-            <w:top w:w="0" w:type="dxa"/>
-            <w:bottom w:w="0" w:type="dxa"/>
-          </w:tblCellMar>
-        </w:tblPrEx>
         <w:tc>
           <w:tcPr>
             <w:tcW w:w="2200" w:type="dxa"/>
@@ -14344,12 +13444,6 @@
         </w:tc>
       </w:tr>
       <w:tr>
-        <w:tblPrEx>
-          <w:tblCellMar>
-            <w:top w:w="0" w:type="dxa"/>
-            <w:bottom w:w="0" w:type="dxa"/>
-          </w:tblCellMar>
-        </w:tblPrEx>
         <w:tc>
           <w:tcPr>
             <w:tcW w:w="2200" w:type="dxa"/>
@@ -14460,12 +13554,6 @@
         </w:tc>
       </w:tr>
       <w:tr>
-        <w:tblPrEx>
-          <w:tblCellMar>
-            <w:top w:w="0" w:type="dxa"/>
-            <w:bottom w:w="0" w:type="dxa"/>
-          </w:tblCellMar>
-        </w:tblPrEx>
         <w:tc>
           <w:tcPr>
             <w:tcW w:w="2200" w:type="dxa"/>
@@ -14576,12 +13664,6 @@
         </w:tc>
       </w:tr>
       <w:tr>
-        <w:tblPrEx>
-          <w:tblCellMar>
-            <w:top w:w="0" w:type="dxa"/>
-            <w:bottom w:w="0" w:type="dxa"/>
-          </w:tblCellMar>
-        </w:tblPrEx>
         <w:tc>
           <w:tcPr>
             <w:tcW w:w="2200" w:type="dxa"/>
@@ -14692,12 +13774,6 @@
         </w:tc>
       </w:tr>
       <w:tr>
-        <w:tblPrEx>
-          <w:tblCellMar>
-            <w:top w:w="0" w:type="dxa"/>
-            <w:bottom w:w="0" w:type="dxa"/>
-          </w:tblCellMar>
-        </w:tblPrEx>
         <w:tc>
           <w:tcPr>
             <w:tcW w:w="2200" w:type="dxa"/>
@@ -14844,12 +13920,6 @@
         <w:gridCol w:w="5760"/>
       </w:tblGrid>
       <w:tr>
-        <w:tblPrEx>
-          <w:tblCellMar>
-            <w:top w:w="0" w:type="dxa"/>
-            <w:bottom w:w="0" w:type="dxa"/>
-          </w:tblCellMar>
-        </w:tblPrEx>
         <w:trPr>
           <w:tblHeader/>
         </w:trPr>
@@ -14954,12 +14024,6 @@
         </w:tc>
       </w:tr>
       <w:tr>
-        <w:tblPrEx>
-          <w:tblCellMar>
-            <w:top w:w="0" w:type="dxa"/>
-            <w:bottom w:w="0" w:type="dxa"/>
-          </w:tblCellMar>
-        </w:tblPrEx>
         <w:tc>
           <w:tcPr>
             <w:tcW w:w="1800" w:type="dxa"/>
@@ -15043,12 +14107,6 @@
         </w:tc>
       </w:tr>
       <w:tr>
-        <w:tblPrEx>
-          <w:tblCellMar>
-            <w:top w:w="0" w:type="dxa"/>
-            <w:bottom w:w="0" w:type="dxa"/>
-          </w:tblCellMar>
-        </w:tblPrEx>
         <w:tc>
           <w:tcPr>
             <w:tcW w:w="1800" w:type="dxa"/>
@@ -15132,12 +14190,6 @@
         </w:tc>
       </w:tr>
       <w:tr>
-        <w:tblPrEx>
-          <w:tblCellMar>
-            <w:top w:w="0" w:type="dxa"/>
-            <w:bottom w:w="0" w:type="dxa"/>
-          </w:tblCellMar>
-        </w:tblPrEx>
         <w:tc>
           <w:tcPr>
             <w:tcW w:w="1800" w:type="dxa"/>
@@ -15221,12 +14273,6 @@
         </w:tc>
       </w:tr>
       <w:tr>
-        <w:tblPrEx>
-          <w:tblCellMar>
-            <w:top w:w="0" w:type="dxa"/>
-            <w:bottom w:w="0" w:type="dxa"/>
-          </w:tblCellMar>
-        </w:tblPrEx>
         <w:tc>
           <w:tcPr>
             <w:tcW w:w="1800" w:type="dxa"/>
@@ -15310,12 +14356,6 @@
         </w:tc>
       </w:tr>
       <w:tr>
-        <w:tblPrEx>
-          <w:tblCellMar>
-            <w:top w:w="0" w:type="dxa"/>
-            <w:bottom w:w="0" w:type="dxa"/>
-          </w:tblCellMar>
-        </w:tblPrEx>
         <w:tc>
           <w:tcPr>
             <w:tcW w:w="1800" w:type="dxa"/>
@@ -15399,12 +14439,6 @@
         </w:tc>
       </w:tr>
       <w:tr>
-        <w:tblPrEx>
-          <w:tblCellMar>
-            <w:top w:w="0" w:type="dxa"/>
-            <w:bottom w:w="0" w:type="dxa"/>
-          </w:tblCellMar>
-        </w:tblPrEx>
         <w:tc>
           <w:tcPr>
             <w:tcW w:w="1800" w:type="dxa"/>
@@ -15536,12 +14570,6 @@
         <w:gridCol w:w="4060"/>
       </w:tblGrid>
       <w:tr>
-        <w:tblPrEx>
-          <w:tblCellMar>
-            <w:top w:w="0" w:type="dxa"/>
-            <w:bottom w:w="0" w:type="dxa"/>
-          </w:tblCellMar>
-        </w:tblPrEx>
         <w:trPr>
           <w:tblHeader/>
         </w:trPr>
@@ -15679,12 +14707,6 @@
         </w:tc>
       </w:tr>
       <w:tr>
-        <w:tblPrEx>
-          <w:tblCellMar>
-            <w:top w:w="0" w:type="dxa"/>
-            <w:bottom w:w="0" w:type="dxa"/>
-          </w:tblCellMar>
-        </w:tblPrEx>
         <w:tc>
           <w:tcPr>
             <w:tcW w:w="2500" w:type="dxa"/>
@@ -15801,12 +14823,6 @@
         </w:tc>
       </w:tr>
       <w:tr>
-        <w:tblPrEx>
-          <w:tblCellMar>
-            <w:top w:w="0" w:type="dxa"/>
-            <w:bottom w:w="0" w:type="dxa"/>
-          </w:tblCellMar>
-        </w:tblPrEx>
         <w:tc>
           <w:tcPr>
             <w:tcW w:w="2500" w:type="dxa"/>
@@ -15917,12 +14933,6 @@
         </w:tc>
       </w:tr>
       <w:tr>
-        <w:tblPrEx>
-          <w:tblCellMar>
-            <w:top w:w="0" w:type="dxa"/>
-            <w:bottom w:w="0" w:type="dxa"/>
-          </w:tblCellMar>
-        </w:tblPrEx>
         <w:tc>
           <w:tcPr>
             <w:tcW w:w="2500" w:type="dxa"/>
@@ -16033,12 +15043,6 @@
         </w:tc>
       </w:tr>
       <w:tr>
-        <w:tblPrEx>
-          <w:tblCellMar>
-            <w:top w:w="0" w:type="dxa"/>
-            <w:bottom w:w="0" w:type="dxa"/>
-          </w:tblCellMar>
-        </w:tblPrEx>
         <w:tc>
           <w:tcPr>
             <w:tcW w:w="2500" w:type="dxa"/>
@@ -16149,12 +15153,6 @@
         </w:tc>
       </w:tr>
       <w:tr>
-        <w:tblPrEx>
-          <w:tblCellMar>
-            <w:top w:w="0" w:type="dxa"/>
-            <w:bottom w:w="0" w:type="dxa"/>
-          </w:tblCellMar>
-        </w:tblPrEx>
         <w:tc>
           <w:tcPr>
             <w:tcW w:w="2500" w:type="dxa"/>
@@ -16265,12 +15263,6 @@
         </w:tc>
       </w:tr>
       <w:tr>
-        <w:tblPrEx>
-          <w:tblCellMar>
-            <w:top w:w="0" w:type="dxa"/>
-            <w:bottom w:w="0" w:type="dxa"/>
-          </w:tblCellMar>
-        </w:tblPrEx>
         <w:tc>
           <w:tcPr>
             <w:tcW w:w="2500" w:type="dxa"/>
@@ -16688,12 +15680,6 @@
         <w:gridCol w:w="6860"/>
       </w:tblGrid>
       <w:tr>
-        <w:tblPrEx>
-          <w:tblCellMar>
-            <w:top w:w="0" w:type="dxa"/>
-            <w:bottom w:w="0" w:type="dxa"/>
-          </w:tblCellMar>
-        </w:tblPrEx>
         <w:trPr>
           <w:tblHeader/>
         </w:trPr>
@@ -16765,12 +15751,6 @@
         </w:tc>
       </w:tr>
       <w:tr>
-        <w:tblPrEx>
-          <w:tblCellMar>
-            <w:top w:w="0" w:type="dxa"/>
-            <w:bottom w:w="0" w:type="dxa"/>
-          </w:tblCellMar>
-        </w:tblPrEx>
         <w:tc>
           <w:tcPr>
             <w:tcW w:w="2500" w:type="dxa"/>
@@ -16827,12 +15807,6 @@
         </w:tc>
       </w:tr>
       <w:tr>
-        <w:tblPrEx>
-          <w:tblCellMar>
-            <w:top w:w="0" w:type="dxa"/>
-            <w:bottom w:w="0" w:type="dxa"/>
-          </w:tblCellMar>
-        </w:tblPrEx>
         <w:tc>
           <w:tcPr>
             <w:tcW w:w="2500" w:type="dxa"/>
@@ -16889,12 +15863,6 @@
         </w:tc>
       </w:tr>
       <w:tr>
-        <w:tblPrEx>
-          <w:tblCellMar>
-            <w:top w:w="0" w:type="dxa"/>
-            <w:bottom w:w="0" w:type="dxa"/>
-          </w:tblCellMar>
-        </w:tblPrEx>
         <w:tc>
           <w:tcPr>
             <w:tcW w:w="2500" w:type="dxa"/>
@@ -16951,12 +15919,6 @@
         </w:tc>
       </w:tr>
       <w:tr>
-        <w:tblPrEx>
-          <w:tblCellMar>
-            <w:top w:w="0" w:type="dxa"/>
-            <w:bottom w:w="0" w:type="dxa"/>
-          </w:tblCellMar>
-        </w:tblPrEx>
         <w:tc>
           <w:tcPr>
             <w:tcW w:w="2500" w:type="dxa"/>
@@ -17013,12 +15975,6 @@
         </w:tc>
       </w:tr>
       <w:tr>
-        <w:tblPrEx>
-          <w:tblCellMar>
-            <w:top w:w="0" w:type="dxa"/>
-            <w:bottom w:w="0" w:type="dxa"/>
-          </w:tblCellMar>
-        </w:tblPrEx>
         <w:tc>
           <w:tcPr>
             <w:tcW w:w="2500" w:type="dxa"/>
@@ -17075,12 +16031,6 @@
         </w:tc>
       </w:tr>
       <w:tr>
-        <w:tblPrEx>
-          <w:tblCellMar>
-            <w:top w:w="0" w:type="dxa"/>
-            <w:bottom w:w="0" w:type="dxa"/>
-          </w:tblCellMar>
-        </w:tblPrEx>
         <w:tc>
           <w:tcPr>
             <w:tcW w:w="2500" w:type="dxa"/>
@@ -17251,12 +16201,6 @@
         <w:gridCol w:w="3930"/>
       </w:tblGrid>
       <w:tr>
-        <w:tblPrEx>
-          <w:tblCellMar>
-            <w:top w:w="0" w:type="dxa"/>
-            <w:bottom w:w="0" w:type="dxa"/>
-          </w:tblCellMar>
-        </w:tblPrEx>
         <w:trPr>
           <w:tblHeader/>
         </w:trPr>
@@ -17361,12 +16305,6 @@
         </w:tc>
       </w:tr>
       <w:tr>
-        <w:tblPrEx>
-          <w:tblCellMar>
-            <w:top w:w="0" w:type="dxa"/>
-            <w:bottom w:w="0" w:type="dxa"/>
-          </w:tblCellMar>
-        </w:tblPrEx>
         <w:tc>
           <w:tcPr>
             <w:tcW w:w="2500" w:type="dxa"/>
@@ -17450,12 +16388,6 @@
         </w:tc>
       </w:tr>
       <w:tr>
-        <w:tblPrEx>
-          <w:tblCellMar>
-            <w:top w:w="0" w:type="dxa"/>
-            <w:bottom w:w="0" w:type="dxa"/>
-          </w:tblCellMar>
-        </w:tblPrEx>
         <w:tc>
           <w:tcPr>
             <w:tcW w:w="2500" w:type="dxa"/>
@@ -17539,12 +16471,6 @@
         </w:tc>
       </w:tr>
       <w:tr>
-        <w:tblPrEx>
-          <w:tblCellMar>
-            <w:top w:w="0" w:type="dxa"/>
-            <w:bottom w:w="0" w:type="dxa"/>
-          </w:tblCellMar>
-        </w:tblPrEx>
         <w:tc>
           <w:tcPr>
             <w:tcW w:w="2500" w:type="dxa"/>
@@ -17628,12 +16554,6 @@
         </w:tc>
       </w:tr>
       <w:tr>
-        <w:tblPrEx>
-          <w:tblCellMar>
-            <w:top w:w="0" w:type="dxa"/>
-            <w:bottom w:w="0" w:type="dxa"/>
-          </w:tblCellMar>
-        </w:tblPrEx>
         <w:tc>
           <w:tcPr>
             <w:tcW w:w="2500" w:type="dxa"/>
@@ -17717,12 +16637,6 @@
         </w:tc>
       </w:tr>
       <w:tr>
-        <w:tblPrEx>
-          <w:tblCellMar>
-            <w:top w:w="0" w:type="dxa"/>
-            <w:bottom w:w="0" w:type="dxa"/>
-          </w:tblCellMar>
-        </w:tblPrEx>
         <w:tc>
           <w:tcPr>
             <w:tcW w:w="2500" w:type="dxa"/>
@@ -17806,12 +16720,6 @@
         </w:tc>
       </w:tr>
       <w:tr>
-        <w:tblPrEx>
-          <w:tblCellMar>
-            <w:top w:w="0" w:type="dxa"/>
-            <w:bottom w:w="0" w:type="dxa"/>
-          </w:tblCellMar>
-        </w:tblPrEx>
         <w:tc>
           <w:tcPr>
             <w:tcW w:w="2500" w:type="dxa"/>
@@ -17895,12 +16803,6 @@
         </w:tc>
       </w:tr>
       <w:tr>
-        <w:tblPrEx>
-          <w:tblCellMar>
-            <w:top w:w="0" w:type="dxa"/>
-            <w:bottom w:w="0" w:type="dxa"/>
-          </w:tblCellMar>
-        </w:tblPrEx>
         <w:tc>
           <w:tcPr>
             <w:tcW w:w="2500" w:type="dxa"/>
@@ -18021,12 +16923,6 @@
         <w:gridCol w:w="2960"/>
       </w:tblGrid>
       <w:tr>
-        <w:tblPrEx>
-          <w:tblCellMar>
-            <w:top w:w="0" w:type="dxa"/>
-            <w:bottom w:w="0" w:type="dxa"/>
-          </w:tblCellMar>
-        </w:tblPrEx>
         <w:trPr>
           <w:tblHeader/>
         </w:trPr>
@@ -18164,12 +17060,6 @@
         </w:tc>
       </w:tr>
       <w:tr>
-        <w:tblPrEx>
-          <w:tblCellMar>
-            <w:top w:w="0" w:type="dxa"/>
-            <w:bottom w:w="0" w:type="dxa"/>
-          </w:tblCellMar>
-        </w:tblPrEx>
         <w:tc>
           <w:tcPr>
             <w:tcW w:w="1600" w:type="dxa"/>

</xml_diff>